<commit_message>
Add Turn Rotation project, remove Music Mixer Platform
Turn Rotation is now featured on the portfolio site (#2, full card) and
added to the Software/Application/Support Engineer resumes, each reframed
for that resume's angle. Music Mixer Platform is removed from the site and
every resume it appeared in.
</commit_message>
<xml_diff>
--- a/public/resumes/Finn-Nguyen-Resume-Application-Engineer.docx
+++ b/public/resumes/Finn-Nguyen-Resume-Application-Engineer.docx
@@ -138,7 +138,7 @@
           <w:sz w:val="19"/>
           <w:szCs w:val="19"/>
         </w:rPr>
-        <w:t xml:space="preserve">REST APIs, Deezer API, payment gateway integration, Strapi CMS</w:t>
+        <w:t>REST APIs, Deezer API, payment gateway integration, Strapi CMS, Amazon Textract</w:t>
       </w:r>
     </w:p>
     <w:p>
@@ -163,7 +163,7 @@
           <w:sz w:val="19"/>
           <w:szCs w:val="19"/>
         </w:rPr>
-        <w:t xml:space="preserve">React, FastAPI, Flask, Firebase</w:t>
+        <w:t>React, FastAPI, Flask, Firebase, Next.js, Supabase, AWS Amplify</w:t>
       </w:r>
     </w:p>
     <w:p>
@@ -320,30 +320,17 @@
       </w:r>
     </w:p>
     <w:p>
-      <w:pPr>
-        <w:spacing w:after="20" w:before="100"/>
-      </w:pPr>
-      <w:r>
-        <w:rPr>
-          <w:rFonts w:ascii="Calibri" w:cs="Calibri" w:eastAsia="Calibri" w:hAnsi="Calibri"/>
-          <w:b/>
-          <w:bCs/>
-          <w:color w:val="222222"/>
-          <w:sz w:val="20"/>
-          <w:szCs w:val="20"/>
-        </w:rPr>
-        <w:t xml:space="preserve">Music Mixer Platform — Team Project</w:t>
-      </w:r>
-      <w:r>
-        <w:rPr>
-          <w:rFonts w:ascii="Calibri" w:cs="Calibri" w:eastAsia="Calibri" w:hAnsi="Calibri"/>
+      <w:r>
+        <w:rPr>
+          <w:b/>
+        </w:rPr>
+        <w:t>Turn Rotation — Salon Operations Platform — Personal Project</w:t>
+      </w:r>
+      <w:r>
+        <w:rPr>
           <w:i/>
-          <w:iCs/>
-          <w:color w:val="555555"/>
-          <w:sz w:val="19"/>
-          <w:szCs w:val="19"/>
-        </w:rPr>
-        <w:t xml:space="preserve">  |  React, FastAPI, Firebase, Demucs | 2025</w:t>
+        </w:rPr>
+        <w:t xml:space="preserve">  |  Next.js, Supabase, AWS Amplify, Amazon Textract | 2026</w:t>
       </w:r>
     </w:p>
     <w:p>
@@ -353,16 +340,9 @@
           <w:ilvl w:val="0"/>
           <w:numId w:val="2"/>
         </w:numPr>
-        <w:spacing w:after="40"/>
-      </w:pPr>
-      <w:r>
-        <w:rPr>
-          <w:rFonts w:ascii="Calibri" w:cs="Calibri" w:eastAsia="Calibri" w:hAnsi="Calibri"/>
-          <w:color w:val="222222"/>
-          <w:sz w:val="19"/>
-          <w:szCs w:val="19"/>
-        </w:rPr>
-        <w:t xml:space="preserve">Integrated the Deezer API for real-time music catalog search and implemented Firebase authentication, combining three external services into a single working product experience.</w:t>
+      </w:pPr>
+      <w:r>
+        <w:t>Integrated Amazon Textract for OCR-based service-menu extraction and AWS Amplify for CI/CD deployment, combining a cloud AI service and a managed hosting pipeline into a single working feature.</w:t>
       </w:r>
     </w:p>
     <w:p>
@@ -372,16 +352,9 @@
           <w:ilvl w:val="0"/>
           <w:numId w:val="2"/>
         </w:numPr>
-        <w:spacing w:after="40"/>
-      </w:pPr>
-      <w:r>
-        <w:rPr>
-          <w:rFonts w:ascii="Calibri" w:cs="Calibri" w:eastAsia="Calibri" w:hAnsi="Calibri"/>
-          <w:color w:val="222222"/>
-          <w:sz w:val="19"/>
-          <w:szCs w:val="19"/>
-        </w:rPr>
-        <w:t xml:space="preserve">Configured an audio-processing pipeline (Pydub, ffmpeg) to support AI-powered vocal/instrument separation end-to-end.</w:t>
+      </w:pPr>
+      <w:r>
+        <w:t>Configured Supabase Auth and Postgres Row Level Security as the authorization layer, translating operational requirements (manager vs. staff access) directly into enforced access-control policies.</w:t>
       </w:r>
     </w:p>
     <w:p>

</xml_diff>